<commit_message>
Restore snapshots; local Verify run produced environment-specific output
</commit_message>
<xml_diff>
--- a/src/Excelsior.Tests/Word/WordTableBuilderTests.InheritsBordersFromHostCustomizedTableGrid.verified.docx
+++ b/src/Excelsior.Tests/Word/WordTableBuilderTests.InheritsBordersFromHostCustomizedTableGrid.verified.docx
@@ -18,6 +18,9 @@
         <w:gridCol/>
       </w:tblGrid>
       <w:tr>
+        <w:trPr>
+          <w:tblHeader/>
+        </w:trPr>
         <w:tc>
           <w:p>
             <w:pPr>
@@ -330,8 +333,8 @@
     <w:tblPr>
       <w:tblBorders>
         <w:top w:val="double" w:color="1F4E79" w:sz="12"/>
+        <w:left w:val="double" w:color="1F4E79" w:sz="12"/>
         <w:bottom w:val="double" w:color="1F4E79" w:sz="12"/>
-        <w:left w:val="double" w:color="1F4E79" w:sz="12"/>
         <w:right w:val="double" w:color="1F4E79" w:sz="12"/>
         <w:insideH w:val="single" w:color="1F4E79" w:sz="4"/>
         <w:insideV w:val="single" w:color="1F4E79" w:sz="4"/>

</xml_diff>